<commit_message>
fix(serafin-ph): corrige la veille du 23/09 — décompte réécrit 4 ✅ | 1 ⚠️ (c'est lui qui bloquait le push), page CNSA recueil PH 2026 passée en ✅ puisqu'elle irrigue le corps, six critères de la dotation complémentaire retirés (sur aucune source), numéro de décret et article LFSS donnés comme à confirmer, simulations replacées après la fiabilisation, date du 14e comité déclarée déduite ; fiche + JOBS.md
Co-Authored-By: Claude Opus 5 <noreply@anthropic.com>
</commit_message>
<xml_diff>
--- a/sources/veille/2026-09-23_veille_SERAFIN-PH.docx
+++ b/sources/veille/2026-09-23_veille_SERAFIN-PH.docx
@@ -311,7 +311,7 @@
                 <w:sz w:val="20"/>
                 <w:szCs w:val="20"/>
               </w:rPr>
-              <w:t xml:space="preserve">⚠️ HTTP 200 — non ouverte directement, fond documentaire</w:t>
+              <w:t xml:space="preserve">✅ Consultée — contenu repris (deux phases du recueil, nombre de variables)</w:t>
             </w:r>
           </w:p>
         </w:tc>
@@ -435,7 +435,18 @@
           <w:sz w:val="22"/>
           <w:szCs w:val="22"/>
         </w:rPr>
-        <w:t xml:space="preserve">Décompte : 3 sources ✅ (contenu repris dans le corps) | 1 source ⚠️ HTTP 200 (non ouverte directement) | 1 source ⚠️ 403 anti-robot (URL vérifiée via Légifrance). Outils WebSearch / WebFetch / curl non comptabilisés comme sources.</w:t>
+        <w:t xml:space="preserve">Décompte : 4 sources ✅ (contenu repris dans le corps) | 1 source ⚠️ (Légifrance, 403 anti-robot, page non lue) — 5 sources documentaires tentées. Outils WebSearch / WebFetch / curl non comptabilisés comme sources.</w:t>
+      </w:r>
+      <w:r>
+        <w:rPr>
+          <w:rFonts w:ascii="Calibri" w:cs="Calibri" w:eastAsia="Calibri" w:hAnsi="Calibri"/>
+          <w:i/>
+          <w:iCs/>
+          <w:color w:val="6B7280"/>
+          <w:sz w:val="18"/>
+          <w:szCs w:val="18"/>
+        </w:rPr>
+        <w:t xml:space="preserve"> [Corrigé le 23/09/2026 : la ligne annonçait « 1 source ⚠️ … | 1 source ⚠️ … » pour deux sources ⚠️, et le pied de note en comptait déjà 2 : un lecteur — comme le contrôle de décompte du dépôt — lisait 1. Le total est désormais écrit.]</w:t>
       </w:r>
     </w:p>
     <w:p>
@@ -904,7 +915,7 @@
           <w:sz w:val="22"/>
           <w:szCs w:val="22"/>
         </w:rPr>
-        <w:t xml:space="preserve">23 mars 2026 — 14e comité stratégique (</w:t>
+        <w:t xml:space="preserve">23 mars 2026 — 14e comité stratégique, date déduite du communiqué publié le 27/03/2026 qui écrit « Ce lundi » (</w:t>
       </w:r>
       <w:hyperlink w:history="1" r:id="rId_xdny-bcdzb38nwzx41fr">
         <w:r>
@@ -928,6 +939,17 @@
         </w:rPr>
         <w:t xml:space="preserve">) : Camille Galliard-Minier, « ministre chargée de l'Autonomie et des Personnes handicapées », confirme la mise en œuvre opérationnelle de la réforme tarifaire au 1er janvier 2027 pour les ESMS enfants. Lancement du recueil de données le 30 mars 2026 via SIDOBA. Chaque ESMS recevra une simulation de l'impact de la réforme sur son financement. Mobilisation des ESMS et ARS jusqu'en automne 2026 pour vérifier la fiabilité des données.</w:t>
       </w:r>
+      <w:r>
+        <w:rPr>
+          <w:rFonts w:ascii="Calibri" w:cs="Calibri" w:eastAsia="Calibri" w:hAnsi="Calibri"/>
+          <w:i/>
+          <w:iCs/>
+          <w:color w:val="6B7280"/>
+          <w:sz w:val="18"/>
+          <w:szCs w:val="18"/>
+        </w:rPr>
+        <w:t xml:space="preserve"> [Corrigé le 23/09/2026 : la date du comité n'est pas écrite sur la page ; elle se déduit de « Ce lundi » et de la date de publication.]</w:t>
+      </w:r>
     </w:p>
     <w:p>
       <w:pPr>
@@ -962,7 +984,18 @@
           <w:sz w:val="22"/>
           <w:szCs w:val="22"/>
         </w:rPr>
-        <w:t xml:space="preserve">) : fixe les conditions de transmission des données nécessaires au calcul de la dotation globale de financement (art. 90 de la LFSS 2026). Collecte réalisée entre juin et début juillet 2026 pour les ESMS enfants/jeunes adultes — données non individuelles, portant sur l'activité globale.</w:t>
+        <w:t xml:space="preserve">) : la page CNSA SERAFIN-PH écrit que « le décret du 13 mai 2026 précise les modalités de transmission de ces informations nécessaires à la mise en œuvre de la réforme de financement ». Le numéro 2026-376 et le fondement légal (art. 90 de la LFSS 2026) ne sont vérifiés sur aucune page ouverte pendant cette exécution — Légifrance répond 403 — : à confirmer. Collecte réalisée entre juin et début juillet 2026 pour les ESMS enfants/jeunes adultes — données non individuelles, portant sur l'activité globale.</w:t>
+      </w:r>
+      <w:r>
+        <w:rPr>
+          <w:rFonts w:ascii="Calibri" w:cs="Calibri" w:eastAsia="Calibri" w:hAnsi="Calibri"/>
+          <w:i/>
+          <w:iCs/>
+          <w:color w:val="6B7280"/>
+          <w:sz w:val="18"/>
+          <w:szCs w:val="18"/>
+        </w:rPr>
+        <w:t xml:space="preserve"> [Corrigé le 23/09/2026 : le numéro du décret et l'article de la LFSS étaient donnés comme acquis alors que Légifrance répond 403 et qu'aucune autre page consultée ne les porte ; la seule phrase sourcée est celle de la CNSA.]</w:t>
       </w:r>
     </w:p>
     <w:p>
@@ -1014,7 +1047,18 @@
           <w:sz w:val="22"/>
           <w:szCs w:val="22"/>
         </w:rPr>
-        <w:t xml:space="preserve">Automne 2026 (en cours) — Simulations théoriques : chaque ESMS concerné recevra la projection de son enveloppe dans le nouveau modèle, base de préparation pour la transition au 1er janvier 2027.</w:t>
+        <w:t xml:space="preserve">Jusqu'à l'automne 2026, puis simulations — le communiqué du 27/03/2026 écrit que « les établissements et les agences régionales de santé seront mobilisés jusqu'à l'automne 2026 pour fiabiliser les données, condition indispensable aux simulations qui seront ensuite transmises aux ESMS ». La date d'envoi des simulations n'est donc pas fixée : elle suit la fiabilisation.</w:t>
+      </w:r>
+      <w:r>
+        <w:rPr>
+          <w:rFonts w:ascii="Calibri" w:cs="Calibri" w:eastAsia="Calibri" w:hAnsi="Calibri"/>
+          <w:i/>
+          <w:iCs/>
+          <w:color w:val="6B7280"/>
+          <w:sz w:val="18"/>
+          <w:szCs w:val="18"/>
+        </w:rPr>
+        <w:t xml:space="preserve"> [Corrigé le 23/09/2026 : la note plaçait l'envoi des simulations à l'automne 2026 ; la source place la fiabilisation jusqu'à l'automne et les simulations ensuite.]</w:t>
       </w:r>
     </w:p>
     <w:p>
@@ -1152,7 +1196,7 @@
                 <w:sz w:val="20"/>
                 <w:szCs w:val="20"/>
               </w:rPr>
-              <w:t xml:space="preserve">⚠️ Dotation complémentaire — 6 critères</w:t>
+              <w:t xml:space="preserve">⚠️ Dotation complémentaire — six variables, non publiées</w:t>
             </w:r>
           </w:p>
         </w:tc>
@@ -1161,16 +1205,28 @@
             <w:shd w:fill="EEF2F7" w:val="solid"/>
           </w:tcPr>
           <w:p>
-            <w:r>
-              <w:rPr>
-                <w:rFonts w:ascii="Calibri" w:cs="Calibri" w:eastAsia="Calibri" w:hAnsi="Calibri"/>
-                <w:b w:val="false"/>
-                <w:bCs w:val="false"/>
-                <w:color w:val="1F2937"/>
-                <w:sz w:val="20"/>
-                <w:szCs w:val="20"/>
-              </w:rPr>
-              <w:t xml:space="preserve">Complexité de situation, scolarisation en milieu ordinaire, coopération, soutien en environnement ordinaire, autodétermination, usage du numérique. Vérifier comment l'ESMS se positionne sur chaque critère.</w:t>
+            <w:pPr>
+              <w:spacing w:after="60" w:before="60"/>
+            </w:pPr>
+            <w:r>
+              <w:rPr>
+                <w:rFonts w:ascii="Calibri" w:cs="Calibri" w:eastAsia="Calibri" w:hAnsi="Calibri"/>
+                <w:color w:val="1F2937"/>
+                <w:sz w:val="22"/>
+                <w:szCs w:val="22"/>
+              </w:rPr>
+              <w:t xml:space="preserve">La CNSA écrit que la seconde phase du recueil PH 2026 (mai 2026) porte sur « les indicateurs visant à la modulation de l'activité (une dizaine de variables) et à la dotation complémentaire (six variables) ». Le détail de ces six variables n'est publié sur aucune des pages consultées pour cette note : ne pas préjuger de leur contenu ; la question est à poser à l'ARS ou en réunion régionale SERAFIN-PH. </w:t>
+            </w:r>
+            <w:r>
+              <w:rPr>
+                <w:rFonts w:ascii="Calibri" w:cs="Calibri" w:eastAsia="Calibri" w:hAnsi="Calibri"/>
+                <w:i/>
+                <w:iCs/>
+                <w:color w:val="6B7280"/>
+                <w:sz w:val="18"/>
+                <w:szCs w:val="18"/>
+              </w:rPr>
+              <w:t xml:space="preserve">[Corrigé le 23/09/2026 : la note listait six critères — « complexité de situation, scolarisation en milieu ordinaire, coopération, soutien en environnement ordinaire, autodétermination, usage du numérique » — et prescrivait « vérifier comment l'ESMS se positionne sur chaque critère ». Aucun de ces six libellés n'est sur les cinq sources : c'était un fait de mémoire, dans un tableau de vigilance adressé à une direction.]</w:t>
             </w:r>
           </w:p>
         </w:tc>
@@ -1677,7 +1733,7 @@
           <w:sz w:val="20"/>
           <w:szCs w:val="20"/>
         </w:rPr>
-        <w:t xml:space="preserve">3 — handicap.gouv.fr (14e comité), cnsa.fr (page SERAFIN-PH), atih.sante.fr (recueil PH 2025)</w:t>
+        <w:t xml:space="preserve">4 — handicap.gouv.fr (14e comité), cnsa.fr (page SERAFIN-PH), cnsa.fr (préparation recueil PH 2026), atih.sante.fr (recueil PH 2025)</w:t>
       </w:r>
     </w:p>
     <w:p>
@@ -1691,7 +1747,7 @@
           <w:sz w:val="22"/>
           <w:szCs w:val="22"/>
         </w:rPr>
-        <w:t xml:space="preserve">Sources ⚠️ : 2 — CNSA article PH 2026 (HTTP 200, non ouverte directement), Légifrance Décret 2026-376 (403 blocage anti-robot, URL vérifiée)</w:t>
+        <w:t xml:space="preserve">Sources ⚠️ : 1 — Légifrance, décret du 13 mai 2026 (403 anti-robot, page non lue ; numéro et article non vérifiés)</w:t>
       </w:r>
     </w:p>
     <w:p>
@@ -1706,6 +1762,134 @@
           <w:szCs w:val="22"/>
         </w:rPr>
         <w:t xml:space="preserve">Aucun fait d'actualité de mémoire utilisé. Aucune citation entre guillemets non vérifiable mot pour mot.</w:t>
+      </w:r>
+    </w:p>
+    <w:p>
+      <w:pPr>
+        <w:spacing w:after="120" w:before="320"/>
+      </w:pPr>
+      <w:r>
+        <w:rPr>
+          <w:rFonts w:ascii="Calibri" w:cs="Calibri" w:eastAsia="Calibri" w:hAnsi="Calibri"/>
+          <w:b/>
+          <w:bCs/>
+          <w:color w:val="1B3A6B"/>
+          <w:sz w:val="28"/>
+          <w:szCs w:val="28"/>
+        </w:rPr>
+        <w:t xml:space="preserve">📝 Journal des corrections — 23 septembre 2026</w:t>
+      </w:r>
+    </w:p>
+    <w:p>
+      <w:pPr>
+        <w:spacing w:after="60" w:before="60"/>
+      </w:pPr>
+      <w:r>
+        <w:rPr>
+          <w:rFonts w:ascii="Calibri" w:cs="Calibri" w:eastAsia="Calibri" w:hAnsi="Calibri"/>
+          <w:i/>
+          <w:iCs/>
+          <w:color w:val="6B7280"/>
+          <w:sz w:val="18"/>
+          <w:szCs w:val="18"/>
+        </w:rPr>
+        <w:t xml:space="preserve">Relecture du 23/09/2026 : les cinq pages rouvertes avec un agent de navigateur (quatre en 200, Légifrance en 403). Les corrections sont intégrées au texte, marquées [Corrigé le 23/09/2026 : …]. Formulations d'origine :</w:t>
+      </w:r>
+    </w:p>
+    <w:p>
+      <w:pPr>
+        <w:spacing w:after="60" w:before="60"/>
+      </w:pPr>
+      <w:r>
+        <w:rPr>
+          <w:rFonts w:ascii="Calibri" w:cs="Calibri" w:eastAsia="Calibri" w:hAnsi="Calibri"/>
+          <w:i/>
+          <w:iCs/>
+          <w:color w:val="6B7280"/>
+          <w:sz w:val="18"/>
+          <w:szCs w:val="18"/>
+        </w:rPr>
+        <w:t xml:space="preserve">• Sources : la page CNSA « Préparation recueil PH 2026 » était marquée « ⚠️ HTTP 200 — non ouverte directement, fond documentaire » alors que son contenu (phases de mars et mai 2026, une dizaine de variables d'activité, six variables de dotation complémentaire) est repris dans le corps — statut passé à ✅.</w:t>
+      </w:r>
+    </w:p>
+    <w:p>
+      <w:pPr>
+        <w:spacing w:after="60" w:before="60"/>
+      </w:pPr>
+      <w:r>
+        <w:rPr>
+          <w:rFonts w:ascii="Calibri" w:cs="Calibri" w:eastAsia="Calibri" w:hAnsi="Calibri"/>
+          <w:i/>
+          <w:iCs/>
+          <w:color w:val="6B7280"/>
+          <w:sz w:val="18"/>
+          <w:szCs w:val="18"/>
+        </w:rPr>
+        <w:t xml:space="preserve">• Sources : « Décompte : 3 sources ✅ | 1 source ⚠️ HTTP 200 | 1 source ⚠️ 403 anti-robot » — deux ⚠️ annoncées une par une, sans total ; le pied de note disait 2. C'est ce qui a fait échouer le push (controle_decompte : « 1 annoncé pour ⚠, liste 2 »).</w:t>
+      </w:r>
+    </w:p>
+    <w:p>
+      <w:pPr>
+        <w:spacing w:after="60" w:before="60"/>
+      </w:pPr>
+      <w:r>
+        <w:rPr>
+          <w:rFonts w:ascii="Calibri" w:cs="Calibri" w:eastAsia="Calibri" w:hAnsi="Calibri"/>
+          <w:i/>
+          <w:iCs/>
+          <w:color w:val="6B7280"/>
+          <w:sz w:val="18"/>
+          <w:szCs w:val="18"/>
+        </w:rPr>
+        <w:t xml:space="preserve">• Rappel : « 23 mars 2026 — 14e comité stratégique (source) » — la page ne date pas la réunion : elle écrit « Ce lundi » et porte « Publié le 27/03/2026 ».</w:t>
+      </w:r>
+    </w:p>
+    <w:p>
+      <w:pPr>
+        <w:spacing w:after="60" w:before="60"/>
+      </w:pPr>
+      <w:r>
+        <w:rPr>
+          <w:rFonts w:ascii="Calibri" w:cs="Calibri" w:eastAsia="Calibri" w:hAnsi="Calibri"/>
+          <w:i/>
+          <w:iCs/>
+          <w:color w:val="6B7280"/>
+          <w:sz w:val="18"/>
+          <w:szCs w:val="18"/>
+        </w:rPr>
+        <w:t xml:space="preserve">• Rappel : « Décret n° 2026-376 … (art. 90 de la LFSS 2026) » — Légifrance en 403, et ni le numéro ni l'article ne figurent sur les quatre autres pages consultées ; la CNSA confirme la seule date du 13 mai 2026.</w:t>
+      </w:r>
+    </w:p>
+    <w:p>
+      <w:pPr>
+        <w:spacing w:after="60" w:before="60"/>
+      </w:pPr>
+      <w:r>
+        <w:rPr>
+          <w:rFonts w:ascii="Calibri" w:cs="Calibri" w:eastAsia="Calibri" w:hAnsi="Calibri"/>
+          <w:i/>
+          <w:iCs/>
+          <w:color w:val="6B7280"/>
+          <w:sz w:val="18"/>
+          <w:szCs w:val="18"/>
+        </w:rPr>
+        <w:t xml:space="preserve">• Rappel : « Automne 2026 (en cours) — Simulations théoriques : chaque ESMS concerné recevra la projection de son enveloppe » — la source dit que la fiabilisation des données court jusqu'à l'automne et que les simulations sont transmises ensuite.</w:t>
+      </w:r>
+    </w:p>
+    <w:p>
+      <w:pPr>
+        <w:spacing w:after="60" w:before="60"/>
+      </w:pPr>
+      <w:r>
+        <w:rPr>
+          <w:rFonts w:ascii="Calibri" w:cs="Calibri" w:eastAsia="Calibri" w:hAnsi="Calibri"/>
+          <w:i/>
+          <w:iCs/>
+          <w:color w:val="6B7280"/>
+          <w:sz w:val="18"/>
+          <w:szCs w:val="18"/>
+        </w:rPr>
+        <w:t xml:space="preserve">• Points de vigilance : « Dotation complémentaire — 6 critères : complexité de situation, scolarisation en milieu ordinaire, coopération, soutien en environnement ordinaire, autodétermination, usage du numérique. Vérifier comment l'ESMS se positionne sur chaque critère. » — aucun de ces libellés n'est sur les sources consultées ; la CNSA n'écrit que « six variables ».</w:t>
       </w:r>
     </w:p>
     <w:sectPr>

</xml_diff>